<commit_message>
Add module 1 Python assignment
</commit_message>
<xml_diff>
--- a/module-1/Yang-Assignment 1.2.docx
+++ b/module-1/Yang-Assignment 1.2.docx
@@ -28,8 +28,6 @@
       <w:r>
         <w:t xml:space="preserve"> </w:t>
       </w:r>
-    </w:p>
-    <w:p>
       <w:r>
         <w:drawing>
           <wp:inline distT="0" distB="0" distL="0" distR="0" wp14:anchorId="047A570C" wp14:editId="1ADF7A0B">
@@ -280,6 +278,118 @@
                     <a:xfrm>
                       <a:off x="0" y="0"/>
                       <a:ext cx="4401164" cy="3086531"/>
+                    </a:xfrm>
+                    <a:prstGeom prst="rect">
+                      <a:avLst/>
+                    </a:prstGeom>
+                  </pic:spPr>
+                </pic:pic>
+              </a:graphicData>
+            </a:graphic>
+          </wp:inline>
+        </w:drawing>
+      </w:r>
+      <w:r>
+        <w:lastRenderedPageBreak/>
+        <w:drawing>
+          <wp:inline distT="0" distB="0" distL="0" distR="0" wp14:anchorId="3CBB66C7" wp14:editId="7C62C79E">
+            <wp:extent cx="5915851" cy="1829055"/>
+            <wp:effectExtent l="0" t="0" r="8890" b="0"/>
+            <wp:docPr id="88905658" name="Picture 1"/>
+            <wp:cNvGraphicFramePr>
+              <a:graphicFrameLocks xmlns:a="http://schemas.openxmlformats.org/drawingml/2006/main" noChangeAspect="1"/>
+            </wp:cNvGraphicFramePr>
+            <a:graphic xmlns:a="http://schemas.openxmlformats.org/drawingml/2006/main">
+              <a:graphicData uri="http://schemas.openxmlformats.org/drawingml/2006/picture">
+                <pic:pic xmlns:pic="http://schemas.openxmlformats.org/drawingml/2006/picture">
+                  <pic:nvPicPr>
+                    <pic:cNvPr id="88905658" name=""/>
+                    <pic:cNvPicPr/>
+                  </pic:nvPicPr>
+                  <pic:blipFill>
+                    <a:blip r:embed="rId12"/>
+                    <a:stretch>
+                      <a:fillRect/>
+                    </a:stretch>
+                  </pic:blipFill>
+                  <pic:spPr>
+                    <a:xfrm>
+                      <a:off x="0" y="0"/>
+                      <a:ext cx="5915851" cy="1829055"/>
+                    </a:xfrm>
+                    <a:prstGeom prst="rect">
+                      <a:avLst/>
+                    </a:prstGeom>
+                  </pic:spPr>
+                </pic:pic>
+              </a:graphicData>
+            </a:graphic>
+          </wp:inline>
+        </w:drawing>
+      </w:r>
+      <w:r>
+        <w:drawing>
+          <wp:inline distT="0" distB="0" distL="0" distR="0" wp14:anchorId="7E3A654C" wp14:editId="46241DCD">
+            <wp:extent cx="5943600" cy="3096895"/>
+            <wp:effectExtent l="0" t="0" r="0" b="8255"/>
+            <wp:docPr id="1117426335" name="Picture 1"/>
+            <wp:cNvGraphicFramePr>
+              <a:graphicFrameLocks xmlns:a="http://schemas.openxmlformats.org/drawingml/2006/main" noChangeAspect="1"/>
+            </wp:cNvGraphicFramePr>
+            <a:graphic xmlns:a="http://schemas.openxmlformats.org/drawingml/2006/main">
+              <a:graphicData uri="http://schemas.openxmlformats.org/drawingml/2006/picture">
+                <pic:pic xmlns:pic="http://schemas.openxmlformats.org/drawingml/2006/picture">
+                  <pic:nvPicPr>
+                    <pic:cNvPr id="1117426335" name=""/>
+                    <pic:cNvPicPr/>
+                  </pic:nvPicPr>
+                  <pic:blipFill>
+                    <a:blip r:embed="rId13"/>
+                    <a:stretch>
+                      <a:fillRect/>
+                    </a:stretch>
+                  </pic:blipFill>
+                  <pic:spPr>
+                    <a:xfrm>
+                      <a:off x="0" y="0"/>
+                      <a:ext cx="5943600" cy="3096895"/>
+                    </a:xfrm>
+                    <a:prstGeom prst="rect">
+                      <a:avLst/>
+                    </a:prstGeom>
+                  </pic:spPr>
+                </pic:pic>
+              </a:graphicData>
+            </a:graphic>
+          </wp:inline>
+        </w:drawing>
+      </w:r>
+      <w:r>
+        <w:drawing>
+          <wp:inline distT="0" distB="0" distL="0" distR="0" wp14:anchorId="30E3C556" wp14:editId="6E99BCEC">
+            <wp:extent cx="5943600" cy="3093085"/>
+            <wp:effectExtent l="0" t="0" r="0" b="0"/>
+            <wp:docPr id="1235032154" name="Picture 1"/>
+            <wp:cNvGraphicFramePr>
+              <a:graphicFrameLocks xmlns:a="http://schemas.openxmlformats.org/drawingml/2006/main" noChangeAspect="1"/>
+            </wp:cNvGraphicFramePr>
+            <a:graphic xmlns:a="http://schemas.openxmlformats.org/drawingml/2006/main">
+              <a:graphicData uri="http://schemas.openxmlformats.org/drawingml/2006/picture">
+                <pic:pic xmlns:pic="http://schemas.openxmlformats.org/drawingml/2006/picture">
+                  <pic:nvPicPr>
+                    <pic:cNvPr id="1235032154" name=""/>
+                    <pic:cNvPicPr/>
+                  </pic:nvPicPr>
+                  <pic:blipFill>
+                    <a:blip r:embed="rId14"/>
+                    <a:stretch>
+                      <a:fillRect/>
+                    </a:stretch>
+                  </pic:blipFill>
+                  <pic:spPr>
+                    <a:xfrm>
+                      <a:off x="0" y="0"/>
+                      <a:ext cx="5943600" cy="3093085"/>
                     </a:xfrm>
                     <a:prstGeom prst="rect">
                       <a:avLst/>

</xml_diff>